<commit_message>
correct preprocessing data and plots
</commit_message>
<xml_diff>
--- a/Numerical_results_report.docx
+++ b/Numerical_results_report.docx
@@ -108,7 +108,7 @@
         <w:t xml:space="preserve">MC1</w:t>
       </w:r>
       <w:r>
-        <w:t xml:space="preserve">) was confirmed for both measures, with a significantly higher NODF and lower Temperature than under the null model (NODF: Z = 19.07, p = .002; Temperature: Z = -14.62, p = .002). This confirmed that participants who succeeded on hard questions (rarely answered correctly) also tended to succeed on easier ones (more commonly answered correctly). A secondary manipulation check (</w:t>
+        <w:t xml:space="preserve">) was confirmed for both measures, with a significantly higher NODF and lower Temperature than under the null model (NODF: Z = 20.29, p = .002; Temperature: Z = -12.67, p = .002). This confirmed that participants who succeeded on hard questions (rarely answered correctly) also tended to succeed on easier ones (more commonly answered correctly). A secondary manipulation check (</w:t>
       </w:r>
       <w:r>
         <w:rPr>
@@ -129,7 +129,7 @@
         <w:t xml:space="preserve"> </w:t>
       </w:r>
       <w:r>
-        <w:t xml:space="preserve">= 3.45, t(12) = 8.95, p = &lt; .001).</w:t>
+        <w:t xml:space="preserve">= 0.24, t(13) = 13, p = &lt; .001).</w:t>
       </w:r>
     </w:p>
     <w:p>
@@ -171,7 +171,7 @@
         <w:t xml:space="preserve"> </w:t>
       </w:r>
       <w:r>
-        <w:t xml:space="preserve">= 0.92, p = &lt; .001). Perceived difficulty and true difficulty were highly correlated (r = 0.92 Pearson’s product-moment correlation t(16273) = 297.22, p = &lt; .001), as visible in Figure</w:t>
+        <w:t xml:space="preserve">= 0.92, p = &lt; .001). Perceived difficulty and true difficulty were highly correlated (r = 0.92 Pearson’s product-moment correlation t(16273) = 299.62, p = &lt; .001), as visible in Figure</w:t>
       </w:r>
       <w:r>
         <w:t xml:space="preserve"> </w:t>
@@ -315,7 +315,7 @@
         <w:t xml:space="preserve"> </w:t>
       </w:r>
       <w:r>
-        <w:t xml:space="preserve">= 0.85, t(404) = 31.84, , p &lt; .001 Adjusted</w:t>
+        <w:t xml:space="preserve">= 0.86, t(418) = 34.72, , p &lt; .001 Adjusted</w:t>
       </w:r>
       <w:r>
         <w:t xml:space="preserve"> </w:t>
@@ -338,7 +338,7 @@
         <w:t xml:space="preserve"> </w:t>
       </w:r>
       <w:r>
-        <w:t xml:space="preserve">= 0.71, F(1,404) = 1,014.07, p &lt; .001). The high correlation (r = 0.85) between average estimated conditional probability and true conditional probability is visualized in Figure</w:t>
+        <w:t xml:space="preserve">= 0.74, F(1,418) = 1,205.28, p &lt; .001). The high correlation (r = 0.86) between average estimated conditional probability and true conditional probability is visualized in Figure</w:t>
       </w:r>
       <w:r>
         <w:t xml:space="preserve"> </w:t>
@@ -386,7 +386,7 @@
         <w:t xml:space="preserve"> </w:t>
       </w:r>
       <w:r>
-        <w:t xml:space="preserve">= 0.93, p &lt; .001, t(4,852.19) = 170.85).</w:t>
+        <w:t xml:space="preserve">= 0.93, p &lt; .001, t(303) = 44.51).</w:t>
       </w:r>
     </w:p>
     <w:p>
@@ -405,7 +405,7 @@
         <w:t xml:space="preserve"> </w:t>
       </w:r>
       <w:r>
-        <w:t xml:space="preserve">= 0.60, p &lt; .001, t(390) = 14.91, Adjusted</w:t>
+        <w:t xml:space="preserve">= 0.85, p &lt; .001, t(448) = 34.03, Adjusted</w:t>
       </w:r>
       <w:r>
         <w:t xml:space="preserve"> </w:t>
@@ -428,7 +428,7 @@
         <w:t xml:space="preserve"> </w:t>
       </w:r>
       <w:r>
-        <w:t xml:space="preserve">= 0.36, F(1,390) = 222.34, p &lt; .001). However, the worst performing participants were far less good at making these predictions than the full set of participants, with their judgments explaining only 36% of the variance in true conditional probabilities.</w:t>
+        <w:t xml:space="preserve">= 0.72, F(1,448) = 1,158.20, p &lt; .001). However, the worst performing participants were far less good at making these predictions than the full set of participants, with their judgments explaining only 36% of the variance in true conditional probabilities.</w:t>
       </w:r>
     </w:p>
     <w:bookmarkEnd w:id="23"/>
@@ -837,7 +837,7 @@
         <w:pStyle w:val="Textkrper"/>
       </w:pPr>
       <w:r>
-        <w:t xml:space="preserve">In confirmation of H3, we found that the Main Model showed a strong correlation with participants’ answers (r = 0.74 Pearson’s product-moment correlation, t(418) = 22.50, p = &lt; .001). The heuristic models were also correlated but to a lesser extent (Threshold: r = 0.62; Anchor: r = 0.60). We further fit three linear models to compare how much variance in participant behaviour is explained by each model. We found that our Main Model explains55% of the variance in participants’ behaviour (</w:t>
+        <w:t xml:space="preserve">In confirmation of H3, we found that the Main Model showed a strong correlation with participants’ answers (r = 0.94 Pearson’s product-moment correlation, t(418) = 58.29, p = &lt; .001). The heuristic models were also correlated but to a lesser extent (Threshold: r = 0.62; Anchor: r = 0.60). We further fit three linear models to compare how much variance in participant behaviour is explained by each model. We found that our Main Model explains89% of the variance in participants’ behaviour (</w:t>
       </w:r>
       <m:oMath>
         <m:r>
@@ -848,7 +848,7 @@
         <w:t xml:space="preserve"> </w:t>
       </w:r>
       <w:r>
-        <w:t xml:space="preserve">= 0.74, t(418) = 22.50, p &lt; .001, Adjusted</w:t>
+        <w:t xml:space="preserve">= 0.94, t(418) = 58.29, p &lt; .001, Adjusted</w:t>
       </w:r>
       <w:r>
         <w:t xml:space="preserve"> </w:t>
@@ -871,7 +871,7 @@
         <w:t xml:space="preserve"> </w:t>
       </w:r>
       <w:r>
-        <w:t xml:space="preserve">= 0.55, F(1,418) = 506.13, p &lt; .001) whereas the Threshold model explains 38% of the variance (</w:t>
+        <w:t xml:space="preserve">= 0.89, F(1,418) = 3,397.64, p &lt; .001) whereas the Threshold model explains 39% of the variance (</w:t>
       </w:r>
       <m:oMath>
         <m:r>
@@ -882,7 +882,7 @@
         <w:t xml:space="preserve"> </w:t>
       </w:r>
       <w:r>
-        <w:t xml:space="preserve">= 0.62, t(418) = 15.96, p &lt; .001, Adjusted</w:t>
+        <w:t xml:space="preserve">= 0.63, t(418) = 16.40, p &lt; .001, Adjusted</w:t>
       </w:r>
       <w:r>
         <w:t xml:space="preserve"> </w:t>
@@ -905,7 +905,7 @@
         <w:t xml:space="preserve"> </w:t>
       </w:r>
       <w:r>
-        <w:t xml:space="preserve">= 0.38, F(1,418) = 254.70, p &lt; .001) and the Anchor model explains 36% of the variance (</w:t>
+        <w:t xml:space="preserve">= 0.39, F(1,418) = 268.99, p &lt; .001) and the Anchor model explains 59% of the variance (</w:t>
       </w:r>
       <m:oMath>
         <m:r>
@@ -916,7 +916,7 @@
         <w:t xml:space="preserve"> </w:t>
       </w:r>
       <w:r>
-        <w:t xml:space="preserve">= 0.60, t(418) = 15.49, p &lt; .001, Adjusted</w:t>
+        <w:t xml:space="preserve">= 0.77, t(418) = 24.39, p &lt; .001, Adjusted</w:t>
       </w:r>
       <w:r>
         <w:t xml:space="preserve"> </w:t>
@@ -939,7 +939,7 @@
         <w:t xml:space="preserve"> </w:t>
       </w:r>
       <w:r>
-        <w:t xml:space="preserve">= 0.36, F(1,418) = 239.92, p &lt; .001). Figure</w:t>
+        <w:t xml:space="preserve">= 0.59, F(1,418) = 594.76, p &lt; .001). Figure</w:t>
       </w:r>
       <w:r>
         <w:t xml:space="preserve"> </w:t>
@@ -1168,7 +1168,7 @@
         <w:t xml:space="preserve"> </w:t>
       </w:r>
       <w:r>
-        <w:t xml:space="preserve">= 18,217.74), confirming</w:t>
+        <w:t xml:space="preserve">= 18,259.96), confirming</w:t>
       </w:r>
       <w:r>
         <w:t xml:space="preserve"> </w:t>
@@ -1200,7 +1200,7 @@
         <w:t xml:space="preserve"> </w:t>
       </w:r>
       <w:r>
-        <w:t xml:space="preserve">respectively. The difference between the BIC of the Main Model and that of the next best heuristic model (Anchor Model) was 2,154.02, which indicates very strong evidence in favor of our Main Model according to the standard interpretation criteria (Raftery, 1995).</w:t>
+        <w:t xml:space="preserve">respectively. The difference between the BIC of the Main Model and that of the next best heuristic model (Anchor Model) was 2,196.24, which indicates very strong evidence in favor of our Main Model according to the standard interpretation criteria (Raftery, 1995).</w:t>
       </w:r>
     </w:p>
     <w:p>
@@ -2825,7 +2825,7 @@
                 <w:szCs w:val="22"/>
                 <w:color w:val="000000"/>
               </w:rPr>
-              <w:t xml:space="preserve">-9099</w:t>
+              <w:t xml:space="preserve">-9120</w:t>
             </w:r>
           </w:p>
         </w:tc>
@@ -2878,7 +2878,7 @@
                 <w:szCs w:val="22"/>
                 <w:color w:val="000000"/>
               </w:rPr>
-              <w:t xml:space="preserve">18218</w:t>
+              <w:t xml:space="preserve">18260</w:t>
             </w:r>
           </w:p>
         </w:tc>
@@ -3090,7 +3090,7 @@
                 <w:szCs w:val="22"/>
                 <w:color w:val="000000"/>
               </w:rPr>
-              <w:t xml:space="preserve">0.42</w:t>
+              <w:t xml:space="preserve">0.33</w:t>
             </w:r>
           </w:p>
         </w:tc>
@@ -4638,7 +4638,7 @@
       </w:tr>
     </w:tbl>
     <w:bookmarkEnd w:id="28"/>
-    <w:bookmarkStart w:id="35" w:name="exploratory-analysis"/>
+    <w:bookmarkStart w:id="32" w:name="exploratory-analysis"/>
     <w:p>
       <w:pPr>
         <w:pStyle w:val="berschrift2"/>
@@ -4685,7 +4685,7 @@
         <w:t xml:space="preserve"> </w:t>
       </w:r>
       <w:r>
-        <w:t xml:space="preserve">= 0.84, t(194) = 20.57, p &lt; .001. Failure:</w:t>
+        <w:t xml:space="preserve">= 0.84, t(208) = 22.79, p &lt; .001. Failure:</w:t>
       </w:r>
       <w:r>
         <w:t xml:space="preserve"> </w:t>
@@ -4699,7 +4699,7 @@
         <w:t xml:space="preserve"> </w:t>
       </w:r>
       <w:r>
-        <w:t xml:space="preserve">= 0.83, t(208) = 21.28, p &lt; .001.)</w:t>
+        <w:t xml:space="preserve">= 0.83, t(208) = 21.26, p &lt; .001.)</w:t>
       </w:r>
     </w:p>
     <w:p>
@@ -4907,54 +4907,7 @@
         <w:t xml:space="preserve">= 80.86 ± 19.80; t(216) = -10.84, p &lt; .001, paired t-test). The Bayesian model was the best model for 72% of participants whereas the Heuristic 1 accounted for 6% and the Heuristic 2 accounted for 21%.</w:t>
       </w:r>
     </w:p>
-    <w:p>
-      <w:pPr>
-        <w:pStyle w:val="Textkrper"/>
-      </w:pPr>
-      <w:r>
-        <w:drawing>
-          <wp:inline>
-            <wp:extent cx="5969000" cy="3686568"/>
-            <wp:effectExtent b="0" l="0" r="0" t="0"/>
-            <wp:docPr descr="" title="" id="33" name="Picture"/>
-            <a:graphic>
-              <a:graphicData uri="http://schemas.openxmlformats.org/drawingml/2006/picture">
-                <pic:pic>
-                  <pic:nvPicPr>
-                    <pic:cNvPr descr="figures/unnamed-chunk-2-1.png" id="34" name="Picture"/>
-                    <pic:cNvPicPr>
-                      <a:picLocks noChangeArrowheads="1" noChangeAspect="1"/>
-                    </pic:cNvPicPr>
-                  </pic:nvPicPr>
-                  <pic:blipFill>
-                    <a:blip r:embed="rId32"/>
-                    <a:stretch>
-                      <a:fillRect/>
-                    </a:stretch>
-                  </pic:blipFill>
-                  <pic:spPr bwMode="auto">
-                    <a:xfrm>
-                      <a:off x="0" y="0"/>
-                      <a:ext cx="5969000" cy="3686568"/>
-                    </a:xfrm>
-                    <a:prstGeom prst="rect">
-                      <a:avLst/>
-                    </a:prstGeom>
-                    <a:noFill/>
-                    <a:ln w="9525">
-                      <a:noFill/>
-                      <a:headEnd/>
-                      <a:tailEnd/>
-                    </a:ln>
-                  </pic:spPr>
-                </pic:pic>
-              </a:graphicData>
-            </a:graphic>
-          </wp:inline>
-        </w:drawing>
-      </w:r>
-    </w:p>
-    <w:bookmarkEnd w:id="35"/>
+    <w:bookmarkEnd w:id="32"/>
     <w:sectPr>
       <w:headerReference r:id="rId8" w:type="even"/>
       <w:headerReference r:id="rId9" w:type="default"/>

</xml_diff>